<commit_message>
word doc complated with reflective statement
</commit_message>
<xml_diff>
--- a/MATLAB Coursework 2  Word Template.docx
+++ b/MATLAB Coursework 2  Word Template.docx
@@ -174,7 +174,6 @@
           </w14:textFill>
         </w:rPr>
       </w:pPr>
-      <w:bookmarkStart w:id="0" w:name="_GoBack"/>
       <w:r>
         <w:rPr>
           <w:rFonts w:hint="default" w:eastAsia="宋体"/>
@@ -225,7 +224,6 @@
         </w:drawing>
       </w:r>
     </w:p>
-    <w:bookmarkEnd w:id="0"/>
     <w:p>
       <w:pPr>
         <w:rPr>
@@ -337,202 +335,8 @@
           </w14:textFill>
         </w:rPr>
       </w:pPr>
-    </w:p>
-    <w:p>
-      <w:pPr>
-        <w:rPr>
-          <w:rFonts w:hint="eastAsia" w:eastAsia="宋体"/>
-          <w:color w:val="000000" w:themeColor="text1"/>
-          <w:lang w:val="en-US" w:eastAsia="zh-CN"/>
-          <w14:textFill>
-            <w14:solidFill>
-              <w14:schemeClr w14:val="tx1"/>
-            </w14:solidFill>
-          </w14:textFill>
-        </w:rPr>
-      </w:pPr>
-    </w:p>
-    <w:p>
-      <w:pPr>
-        <w:rPr>
-          <w:rFonts w:hint="eastAsia" w:eastAsia="宋体"/>
-          <w:color w:val="000000" w:themeColor="text1"/>
-          <w:lang w:val="en-US" w:eastAsia="zh-CN"/>
-          <w14:textFill>
-            <w14:solidFill>
-              <w14:schemeClr w14:val="tx1"/>
-            </w14:solidFill>
-          </w14:textFill>
-        </w:rPr>
-      </w:pPr>
-    </w:p>
-    <w:p>
-      <w:pPr>
-        <w:rPr>
-          <w:rFonts w:hint="eastAsia" w:eastAsia="宋体"/>
-          <w:color w:val="000000" w:themeColor="text1"/>
-          <w:lang w:val="en-US" w:eastAsia="zh-CN"/>
-          <w14:textFill>
-            <w14:solidFill>
-              <w14:schemeClr w14:val="tx1"/>
-            </w14:solidFill>
-          </w14:textFill>
-        </w:rPr>
-      </w:pPr>
-    </w:p>
-    <w:p>
-      <w:pPr>
-        <w:rPr>
-          <w:rFonts w:hint="eastAsia" w:eastAsia="宋体"/>
-          <w:color w:val="000000" w:themeColor="text1"/>
-          <w:lang w:val="en-US" w:eastAsia="zh-CN"/>
-          <w14:textFill>
-            <w14:solidFill>
-              <w14:schemeClr w14:val="tx1"/>
-            </w14:solidFill>
-          </w14:textFill>
-        </w:rPr>
-      </w:pPr>
-    </w:p>
-    <w:p>
-      <w:pPr>
-        <w:rPr>
-          <w:rFonts w:hint="eastAsia" w:eastAsia="宋体"/>
-          <w:color w:val="000000" w:themeColor="text1"/>
-          <w:lang w:val="en-US" w:eastAsia="zh-CN"/>
-          <w14:textFill>
-            <w14:solidFill>
-              <w14:schemeClr w14:val="tx1"/>
-            </w14:solidFill>
-          </w14:textFill>
-        </w:rPr>
-      </w:pPr>
-    </w:p>
-    <w:p>
-      <w:pPr>
-        <w:rPr>
-          <w:rFonts w:hint="eastAsia" w:eastAsia="宋体"/>
-          <w:color w:val="000000" w:themeColor="text1"/>
-          <w:lang w:val="en-US" w:eastAsia="zh-CN"/>
-          <w14:textFill>
-            <w14:solidFill>
-              <w14:schemeClr w14:val="tx1"/>
-            </w14:solidFill>
-          </w14:textFill>
-        </w:rPr>
-      </w:pPr>
-    </w:p>
-    <w:p>
-      <w:pPr>
-        <w:rPr>
-          <w:rFonts w:hint="eastAsia" w:eastAsia="宋体"/>
-          <w:color w:val="000000" w:themeColor="text1"/>
-          <w:lang w:val="en-US" w:eastAsia="zh-CN"/>
-          <w14:textFill>
-            <w14:solidFill>
-              <w14:schemeClr w14:val="tx1"/>
-            </w14:solidFill>
-          </w14:textFill>
-        </w:rPr>
-      </w:pPr>
-    </w:p>
-    <w:p>
-      <w:pPr>
-        <w:rPr>
-          <w:rFonts w:hint="eastAsia" w:eastAsia="宋体"/>
-          <w:color w:val="000000" w:themeColor="text1"/>
-          <w:lang w:val="en-US" w:eastAsia="zh-CN"/>
-          <w14:textFill>
-            <w14:solidFill>
-              <w14:schemeClr w14:val="tx1"/>
-            </w14:solidFill>
-          </w14:textFill>
-        </w:rPr>
-      </w:pPr>
-    </w:p>
-    <w:p>
-      <w:pPr>
-        <w:rPr>
-          <w:rFonts w:hint="eastAsia" w:eastAsia="宋体"/>
-          <w:color w:val="000000" w:themeColor="text1"/>
-          <w:lang w:val="en-US" w:eastAsia="zh-CN"/>
-          <w14:textFill>
-            <w14:solidFill>
-              <w14:schemeClr w14:val="tx1"/>
-            </w14:solidFill>
-          </w14:textFill>
-        </w:rPr>
-      </w:pPr>
-    </w:p>
-    <w:p>
-      <w:pPr>
-        <w:rPr>
-          <w:rFonts w:hint="eastAsia" w:eastAsia="宋体"/>
-          <w:color w:val="000000" w:themeColor="text1"/>
-          <w:lang w:val="en-US" w:eastAsia="zh-CN"/>
-          <w14:textFill>
-            <w14:solidFill>
-              <w14:schemeClr w14:val="tx1"/>
-            </w14:solidFill>
-          </w14:textFill>
-        </w:rPr>
-      </w:pPr>
-    </w:p>
-    <w:p>
-      <w:pPr>
-        <w:rPr>
-          <w:rFonts w:hint="eastAsia" w:eastAsia="宋体"/>
-          <w:color w:val="000000" w:themeColor="text1"/>
-          <w:lang w:val="en-US" w:eastAsia="zh-CN"/>
-          <w14:textFill>
-            <w14:solidFill>
-              <w14:schemeClr w14:val="tx1"/>
-            </w14:solidFill>
-          </w14:textFill>
-        </w:rPr>
-      </w:pPr>
-    </w:p>
-    <w:p>
-      <w:pPr>
-        <w:rPr>
-          <w:rFonts w:hint="eastAsia" w:eastAsia="宋体"/>
-          <w:color w:val="000000" w:themeColor="text1"/>
-          <w:lang w:val="en-US" w:eastAsia="zh-CN"/>
-          <w14:textFill>
-            <w14:solidFill>
-              <w14:schemeClr w14:val="tx1"/>
-            </w14:solidFill>
-          </w14:textFill>
-        </w:rPr>
-      </w:pPr>
-    </w:p>
-    <w:p>
-      <w:pPr>
-        <w:rPr>
-          <w:rFonts w:hint="eastAsia" w:eastAsia="宋体"/>
-          <w:color w:val="000000" w:themeColor="text1"/>
-          <w:lang w:val="en-US" w:eastAsia="zh-CN"/>
-          <w14:textFill>
-            <w14:solidFill>
-              <w14:schemeClr w14:val="tx1"/>
-            </w14:solidFill>
-          </w14:textFill>
-        </w:rPr>
-      </w:pPr>
-    </w:p>
-    <w:p>
-      <w:pPr>
-        <w:rPr>
-          <w:rFonts w:hint="eastAsia" w:eastAsia="宋体"/>
-          <w:color w:val="000000" w:themeColor="text1"/>
-          <w:lang w:val="en-US" w:eastAsia="zh-CN"/>
-          <w14:textFill>
-            <w14:solidFill>
-              <w14:schemeClr w14:val="tx1"/>
-            </w14:solidFill>
-          </w14:textFill>
-        </w:rPr>
-      </w:pPr>
+      <w:bookmarkStart w:id="0" w:name="_GoBack"/>
+      <w:bookmarkEnd w:id="0"/>
       <w:r>
         <w:rPr>
           <w:rFonts w:hint="eastAsia" w:eastAsia="宋体"/>
@@ -784,8 +588,8 @@
       <w:r>
         <w:drawing>
           <wp:inline distT="0" distB="0" distL="114300" distR="114300">
-            <wp:extent cx="4930140" cy="4046855"/>
-            <wp:effectExtent l="0" t="0" r="3810" b="1270"/>
+            <wp:extent cx="4384675" cy="3599180"/>
+            <wp:effectExtent l="0" t="0" r="6350" b="1270"/>
             <wp:docPr id="2" name="图片 1"/>
             <wp:cNvGraphicFramePr>
               <a:graphicFrameLocks xmlns:a="http://schemas.openxmlformats.org/drawingml/2006/main" noChangeAspect="1"/>
@@ -808,7 +612,7 @@
                   <pic:spPr>
                     <a:xfrm>
                       <a:off x="0" y="0"/>
-                      <a:ext cx="4930140" cy="4046855"/>
+                      <a:ext cx="4384675" cy="3599180"/>
                     </a:xfrm>
                     <a:prstGeom prst="rect">
                       <a:avLst/>
@@ -1160,6 +964,921 @@
         </w:rPr>
       </w:pPr>
     </w:p>
+    <w:p>
+      <w:pPr>
+        <w:spacing w:line="259" w:lineRule="auto"/>
+        <w:jc w:val="both"/>
+        <w:rPr>
+          <w:color w:val="000000" w:themeColor="text1"/>
+          <w:highlight w:val="cyan"/>
+          <w14:textFill>
+            <w14:solidFill>
+              <w14:schemeClr w14:val="tx1"/>
+            </w14:solidFill>
+          </w14:textFill>
+        </w:rPr>
+      </w:pPr>
+    </w:p>
+    <w:p>
+      <w:pPr>
+        <w:spacing w:line="259" w:lineRule="auto"/>
+        <w:jc w:val="both"/>
+        <w:rPr>
+          <w:color w:val="000000" w:themeColor="text1"/>
+          <w:highlight w:val="cyan"/>
+          <w14:textFill>
+            <w14:solidFill>
+              <w14:schemeClr w14:val="tx1"/>
+            </w14:solidFill>
+          </w14:textFill>
+        </w:rPr>
+      </w:pPr>
+    </w:p>
+    <w:p>
+      <w:pPr>
+        <w:spacing w:line="259" w:lineRule="auto"/>
+        <w:jc w:val="both"/>
+        <w:rPr>
+          <w:color w:val="000000" w:themeColor="text1"/>
+          <w:highlight w:val="cyan"/>
+          <w14:textFill>
+            <w14:solidFill>
+              <w14:schemeClr w14:val="tx1"/>
+            </w14:solidFill>
+          </w14:textFill>
+        </w:rPr>
+      </w:pPr>
+    </w:p>
+    <w:p>
+      <w:pPr>
+        <w:spacing w:line="259" w:lineRule="auto"/>
+        <w:jc w:val="both"/>
+        <w:rPr>
+          <w:color w:val="000000" w:themeColor="text1"/>
+          <w:highlight w:val="cyan"/>
+          <w14:textFill>
+            <w14:solidFill>
+              <w14:schemeClr w14:val="tx1"/>
+            </w14:solidFill>
+          </w14:textFill>
+        </w:rPr>
+      </w:pPr>
+    </w:p>
+    <w:p>
+      <w:pPr>
+        <w:spacing w:line="259" w:lineRule="auto"/>
+        <w:jc w:val="both"/>
+        <w:rPr>
+          <w:color w:val="000000" w:themeColor="text1"/>
+          <w:highlight w:val="cyan"/>
+          <w14:textFill>
+            <w14:solidFill>
+              <w14:schemeClr w14:val="tx1"/>
+            </w14:solidFill>
+          </w14:textFill>
+        </w:rPr>
+      </w:pPr>
+    </w:p>
+    <w:p>
+      <w:pPr>
+        <w:spacing w:line="259" w:lineRule="auto"/>
+        <w:jc w:val="both"/>
+        <w:rPr>
+          <w:color w:val="000000" w:themeColor="text1"/>
+          <w:highlight w:val="cyan"/>
+          <w14:textFill>
+            <w14:solidFill>
+              <w14:schemeClr w14:val="tx1"/>
+            </w14:solidFill>
+          </w14:textFill>
+        </w:rPr>
+      </w:pPr>
+    </w:p>
+    <w:p>
+      <w:pPr>
+        <w:spacing w:line="259" w:lineRule="auto"/>
+        <w:jc w:val="both"/>
+        <w:rPr>
+          <w:color w:val="000000" w:themeColor="text1"/>
+          <w:highlight w:val="cyan"/>
+          <w14:textFill>
+            <w14:solidFill>
+              <w14:schemeClr w14:val="tx1"/>
+            </w14:solidFill>
+          </w14:textFill>
+        </w:rPr>
+      </w:pPr>
+    </w:p>
+    <w:p>
+      <w:pPr>
+        <w:spacing w:line="259" w:lineRule="auto"/>
+        <w:jc w:val="both"/>
+        <w:rPr>
+          <w:color w:val="000000" w:themeColor="text1"/>
+          <w:highlight w:val="cyan"/>
+          <w14:textFill>
+            <w14:solidFill>
+              <w14:schemeClr w14:val="tx1"/>
+            </w14:solidFill>
+          </w14:textFill>
+        </w:rPr>
+      </w:pPr>
+    </w:p>
+    <w:p>
+      <w:pPr>
+        <w:spacing w:line="259" w:lineRule="auto"/>
+        <w:jc w:val="both"/>
+        <w:rPr>
+          <w:color w:val="000000" w:themeColor="text1"/>
+          <w:highlight w:val="cyan"/>
+          <w14:textFill>
+            <w14:solidFill>
+              <w14:schemeClr w14:val="tx1"/>
+            </w14:solidFill>
+          </w14:textFill>
+        </w:rPr>
+      </w:pPr>
+    </w:p>
+    <w:p>
+      <w:pPr>
+        <w:spacing w:line="259" w:lineRule="auto"/>
+        <w:jc w:val="both"/>
+        <w:rPr>
+          <w:color w:val="000000" w:themeColor="text1"/>
+          <w:highlight w:val="cyan"/>
+          <w14:textFill>
+            <w14:solidFill>
+              <w14:schemeClr w14:val="tx1"/>
+            </w14:solidFill>
+          </w14:textFill>
+        </w:rPr>
+      </w:pPr>
+    </w:p>
+    <w:p>
+      <w:pPr>
+        <w:spacing w:line="259" w:lineRule="auto"/>
+        <w:jc w:val="both"/>
+        <w:rPr>
+          <w:color w:val="000000" w:themeColor="text1"/>
+          <w:highlight w:val="cyan"/>
+          <w14:textFill>
+            <w14:solidFill>
+              <w14:schemeClr w14:val="tx1"/>
+            </w14:solidFill>
+          </w14:textFill>
+        </w:rPr>
+      </w:pPr>
+    </w:p>
+    <w:p>
+      <w:pPr>
+        <w:spacing w:line="259" w:lineRule="auto"/>
+        <w:jc w:val="both"/>
+        <w:rPr>
+          <w:color w:val="000000" w:themeColor="text1"/>
+          <w:highlight w:val="cyan"/>
+          <w14:textFill>
+            <w14:solidFill>
+              <w14:schemeClr w14:val="tx1"/>
+            </w14:solidFill>
+          </w14:textFill>
+        </w:rPr>
+      </w:pPr>
+    </w:p>
+    <w:p>
+      <w:pPr>
+        <w:spacing w:line="259" w:lineRule="auto"/>
+        <w:jc w:val="both"/>
+        <w:rPr>
+          <w:color w:val="000000" w:themeColor="text1"/>
+          <w:highlight w:val="cyan"/>
+          <w14:textFill>
+            <w14:solidFill>
+              <w14:schemeClr w14:val="tx1"/>
+            </w14:solidFill>
+          </w14:textFill>
+        </w:rPr>
+      </w:pPr>
+    </w:p>
+    <w:p>
+      <w:pPr>
+        <w:spacing w:line="259" w:lineRule="auto"/>
+        <w:jc w:val="both"/>
+        <w:rPr>
+          <w:color w:val="000000" w:themeColor="text1"/>
+          <w:highlight w:val="cyan"/>
+          <w14:textFill>
+            <w14:solidFill>
+              <w14:schemeClr w14:val="tx1"/>
+            </w14:solidFill>
+          </w14:textFill>
+        </w:rPr>
+      </w:pPr>
+    </w:p>
+    <w:p>
+      <w:pPr>
+        <w:spacing w:line="259" w:lineRule="auto"/>
+        <w:jc w:val="both"/>
+        <w:rPr>
+          <w:color w:val="000000" w:themeColor="text1"/>
+          <w:highlight w:val="cyan"/>
+          <w14:textFill>
+            <w14:solidFill>
+              <w14:schemeClr w14:val="tx1"/>
+            </w14:solidFill>
+          </w14:textFill>
+        </w:rPr>
+      </w:pPr>
+    </w:p>
+    <w:p>
+      <w:pPr>
+        <w:spacing w:line="259" w:lineRule="auto"/>
+        <w:jc w:val="both"/>
+        <w:rPr>
+          <w:color w:val="000000" w:themeColor="text1"/>
+          <w:highlight w:val="cyan"/>
+          <w14:textFill>
+            <w14:solidFill>
+              <w14:schemeClr w14:val="tx1"/>
+            </w14:solidFill>
+          </w14:textFill>
+        </w:rPr>
+      </w:pPr>
+    </w:p>
+    <w:p>
+      <w:pPr>
+        <w:spacing w:line="259" w:lineRule="auto"/>
+        <w:jc w:val="both"/>
+        <w:rPr>
+          <w:rFonts w:hint="eastAsia"/>
+          <w:color w:val="000000" w:themeColor="text1"/>
+          <w:highlight w:val="none"/>
+          <w14:textFill>
+            <w14:solidFill>
+              <w14:schemeClr w14:val="tx1"/>
+            </w14:solidFill>
+          </w14:textFill>
+        </w:rPr>
+      </w:pPr>
+      <w:r>
+        <w:rPr>
+          <w:rFonts w:hint="eastAsia"/>
+          <w:color w:val="000000" w:themeColor="text1"/>
+          <w:highlight w:val="none"/>
+          <w14:textFill>
+            <w14:solidFill>
+              <w14:schemeClr w14:val="tx1"/>
+            </w14:solidFill>
+          </w14:textFill>
+        </w:rPr>
+        <w:t xml:space="preserve">Task 4 </w:t>
+      </w:r>
+      <w:r>
+        <w:rPr>
+          <w:rFonts w:hint="eastAsia" w:eastAsia="宋体"/>
+          <w:color w:val="000000" w:themeColor="text1"/>
+          <w:highlight w:val="none"/>
+          <w:lang w:val="en-US" w:eastAsia="zh-CN"/>
+          <w14:textFill>
+            <w14:solidFill>
+              <w14:schemeClr w14:val="tx1"/>
+            </w14:solidFill>
+          </w14:textFill>
+        </w:rPr>
+        <w:t>:</w:t>
+      </w:r>
+      <w:r>
+        <w:rPr>
+          <w:rFonts w:hint="eastAsia"/>
+          <w:color w:val="000000" w:themeColor="text1"/>
+          <w:highlight w:val="none"/>
+          <w14:textFill>
+            <w14:solidFill>
+              <w14:schemeClr w14:val="tx1"/>
+            </w14:solidFill>
+          </w14:textFill>
+        </w:rPr>
+        <w:t xml:space="preserve"> Reflective Statement</w:t>
+      </w:r>
+    </w:p>
+    <w:p>
+      <w:pPr>
+        <w:spacing w:line="259" w:lineRule="auto"/>
+        <w:jc w:val="both"/>
+        <w:rPr>
+          <w:rFonts w:hint="eastAsia" w:ascii="Arial" w:hAnsi="Arial" w:eastAsia="宋体" w:cs="Arial"/>
+          <w:color w:val="000000" w:themeColor="text1"/>
+          <w:sz w:val="22"/>
+          <w:szCs w:val="22"/>
+          <w:highlight w:val="none"/>
+          <w:lang w:val="en-US" w:eastAsia="zh-CN"/>
+          <w14:textFill>
+            <w14:solidFill>
+              <w14:schemeClr w14:val="tx1"/>
+            </w14:solidFill>
+          </w14:textFill>
+        </w:rPr>
+      </w:pPr>
+      <w:r>
+        <w:rPr>
+          <w:rFonts w:hint="default" w:ascii="Arial" w:hAnsi="Arial" w:eastAsia="宋体" w:cs="Arial"/>
+          <w:color w:val="000000" w:themeColor="text1"/>
+          <w:sz w:val="22"/>
+          <w:szCs w:val="22"/>
+          <w:highlight w:val="none"/>
+          <w:lang w:val="en-US" w:eastAsia="zh-CN"/>
+          <w14:textFill>
+            <w14:solidFill>
+              <w14:schemeClr w14:val="tx1"/>
+            </w14:solidFill>
+          </w14:textFill>
+        </w:rPr>
+        <w:t xml:space="preserve">This project contains </w:t>
+      </w:r>
+      <w:r>
+        <w:rPr>
+          <w:rFonts w:hint="eastAsia" w:ascii="Arial" w:hAnsi="Arial" w:eastAsia="宋体" w:cs="Arial"/>
+          <w:color w:val="000000" w:themeColor="text1"/>
+          <w:sz w:val="22"/>
+          <w:szCs w:val="22"/>
+          <w:highlight w:val="none"/>
+          <w:lang w:val="en-US" w:eastAsia="zh-CN"/>
+          <w14:textFill>
+            <w14:solidFill>
+              <w14:schemeClr w14:val="tx1"/>
+            </w14:solidFill>
+          </w14:textFill>
+        </w:rPr>
+        <w:t>developing a script to read temperature data, plot, and write to a log file, a function to monitor real-time temperature and a function to predict temperature in MATLAB using an adds-on called Arduino. The goal was to implement precise data acquisition, live visualization, and alerting system with temperature sensor.</w:t>
+      </w:r>
+    </w:p>
+    <w:p>
+      <w:pPr>
+        <w:spacing w:line="259" w:lineRule="auto"/>
+        <w:jc w:val="both"/>
+        <w:rPr>
+          <w:rFonts w:hint="eastAsia" w:ascii="Arial" w:hAnsi="Arial" w:eastAsia="宋体" w:cs="Arial"/>
+          <w:color w:val="000000" w:themeColor="text1"/>
+          <w:sz w:val="22"/>
+          <w:szCs w:val="22"/>
+          <w:highlight w:val="none"/>
+          <w:lang w:val="en-US" w:eastAsia="zh-CN"/>
+          <w14:textFill>
+            <w14:solidFill>
+              <w14:schemeClr w14:val="tx1"/>
+            </w14:solidFill>
+          </w14:textFill>
+        </w:rPr>
+      </w:pPr>
+      <w:r>
+        <w:rPr>
+          <w:rFonts w:hint="eastAsia" w:ascii="Arial" w:hAnsi="Arial" w:eastAsia="宋体" w:cs="Arial"/>
+          <w:color w:val="000000" w:themeColor="text1"/>
+          <w:sz w:val="22"/>
+          <w:szCs w:val="22"/>
+          <w:highlight w:val="none"/>
+          <w:lang w:val="en-US" w:eastAsia="zh-CN"/>
+          <w14:textFill>
+            <w14:solidFill>
+              <w14:schemeClr w14:val="tx1"/>
+            </w14:solidFill>
+          </w14:textFill>
+        </w:rPr>
+        <w:t>Challenges:</w:t>
+      </w:r>
+    </w:p>
+    <w:p>
+      <w:pPr>
+        <w:spacing w:line="259" w:lineRule="auto"/>
+        <w:jc w:val="both"/>
+        <w:rPr>
+          <w:rFonts w:hint="eastAsia" w:ascii="Arial" w:hAnsi="Arial" w:eastAsia="宋体" w:cs="Arial"/>
+          <w:color w:val="000000" w:themeColor="text1"/>
+          <w:sz w:val="22"/>
+          <w:szCs w:val="22"/>
+          <w:highlight w:val="none"/>
+          <w:lang w:val="en-US" w:eastAsia="zh-CN"/>
+          <w14:textFill>
+            <w14:solidFill>
+              <w14:schemeClr w14:val="tx1"/>
+            </w14:solidFill>
+          </w14:textFill>
+        </w:rPr>
+      </w:pPr>
+      <w:r>
+        <w:rPr>
+          <w:rFonts w:hint="eastAsia" w:ascii="Arial" w:hAnsi="Arial" w:eastAsia="宋体" w:cs="Arial"/>
+          <w:color w:val="000000" w:themeColor="text1"/>
+          <w:sz w:val="22"/>
+          <w:szCs w:val="22"/>
+          <w:highlight w:val="none"/>
+          <w:lang w:val="en-US" w:eastAsia="zh-CN"/>
+          <w14:textFill>
+            <w14:solidFill>
+              <w14:schemeClr w14:val="tx1"/>
+            </w14:solidFill>
+          </w14:textFill>
+        </w:rPr>
+        <w:t>The primary challenge was maintaining time consistency. Initially, implementing the blinking LED alerts for Task 2 introduced significant delays, as the pause commands for blinking interfered with the 1Hz sampling frequency. I resolved this by calculating "compensation pauses" (e.g.: pause 0.5s when red LED blinks) to ensure each loop iteration took exactly one second. Another challenge was the logic conflict where multiple LEDs could stay on simultaneously. I addressed this by turning off all other LEDs in the loop when one is working.</w:t>
+      </w:r>
+    </w:p>
+    <w:p>
+      <w:pPr>
+        <w:spacing w:line="259" w:lineRule="auto"/>
+        <w:jc w:val="both"/>
+        <w:rPr>
+          <w:rFonts w:hint="eastAsia" w:ascii="Arial" w:hAnsi="Arial" w:eastAsia="宋体" w:cs="Arial"/>
+          <w:color w:val="000000" w:themeColor="text1"/>
+          <w:sz w:val="22"/>
+          <w:szCs w:val="22"/>
+          <w:highlight w:val="none"/>
+          <w:lang w:val="en-US" w:eastAsia="zh-CN"/>
+          <w14:textFill>
+            <w14:solidFill>
+              <w14:schemeClr w14:val="tx1"/>
+            </w14:solidFill>
+          </w14:textFill>
+        </w:rPr>
+      </w:pPr>
+      <w:r>
+        <w:rPr>
+          <w:rFonts w:hint="default" w:ascii="Arial" w:hAnsi="Arial" w:eastAsia="宋体" w:cs="Arial"/>
+          <w:color w:val="000000" w:themeColor="text1"/>
+          <w:sz w:val="22"/>
+          <w:szCs w:val="22"/>
+          <w:highlight w:val="none"/>
+          <w:lang w:val="en-US" w:eastAsia="zh-CN"/>
+          <w14:textFill>
+            <w14:solidFill>
+              <w14:schemeClr w14:val="tx1"/>
+            </w14:solidFill>
+          </w14:textFill>
+        </w:rPr>
+        <w:t>Strengths</w:t>
+      </w:r>
+      <w:r>
+        <w:rPr>
+          <w:rFonts w:hint="eastAsia" w:ascii="Arial" w:hAnsi="Arial" w:eastAsia="宋体" w:cs="Arial"/>
+          <w:color w:val="000000" w:themeColor="text1"/>
+          <w:sz w:val="22"/>
+          <w:szCs w:val="22"/>
+          <w:highlight w:val="none"/>
+          <w:lang w:val="en-US" w:eastAsia="zh-CN"/>
+          <w14:textFill>
+            <w14:solidFill>
+              <w14:schemeClr w14:val="tx1"/>
+            </w14:solidFill>
+          </w14:textFill>
+        </w:rPr>
+        <w:t>:</w:t>
+      </w:r>
+    </w:p>
+    <w:p>
+      <w:pPr>
+        <w:spacing w:line="259" w:lineRule="auto"/>
+        <w:jc w:val="both"/>
+        <w:rPr>
+          <w:rFonts w:hint="eastAsia" w:ascii="Arial" w:hAnsi="Arial" w:eastAsia="宋体" w:cs="Arial"/>
+          <w:color w:val="000000" w:themeColor="text1"/>
+          <w:sz w:val="22"/>
+          <w:szCs w:val="22"/>
+          <w:highlight w:val="none"/>
+          <w:lang w:val="en-US" w:eastAsia="zh-CN"/>
+          <w14:textFill>
+            <w14:solidFill>
+              <w14:schemeClr w14:val="tx1"/>
+            </w14:solidFill>
+          </w14:textFill>
+        </w:rPr>
+      </w:pPr>
+      <w:r>
+        <w:rPr>
+          <w:rFonts w:hint="default" w:ascii="Arial" w:hAnsi="Arial" w:eastAsia="宋体" w:cs="Arial"/>
+          <w:color w:val="000000" w:themeColor="text1"/>
+          <w:sz w:val="22"/>
+          <w:szCs w:val="22"/>
+          <w:highlight w:val="none"/>
+          <w:lang w:val="en-US" w:eastAsia="zh-CN"/>
+          <w14:textFill>
+            <w14:solidFill>
+              <w14:schemeClr w14:val="tx1"/>
+            </w14:solidFill>
+          </w14:textFill>
+        </w:rPr>
+        <w:t>A major strength of the final implementation is the transition from a simple counter-based timing to the “tic”/</w:t>
+      </w:r>
+      <w:r>
+        <w:rPr>
+          <w:rFonts w:hint="eastAsia" w:ascii="Arial" w:hAnsi="Arial" w:eastAsia="宋体" w:cs="Arial"/>
+          <w:color w:val="000000" w:themeColor="text1"/>
+          <w:sz w:val="22"/>
+          <w:szCs w:val="22"/>
+          <w:highlight w:val="none"/>
+          <w:lang w:val="en-US" w:eastAsia="zh-CN"/>
+          <w14:textFill>
+            <w14:solidFill>
+              <w14:schemeClr w14:val="tx1"/>
+            </w14:solidFill>
+          </w14:textFill>
+        </w:rPr>
+        <w:t xml:space="preserve"> </w:t>
+      </w:r>
+      <w:r>
+        <w:rPr>
+          <w:rFonts w:hint="default" w:ascii="Arial" w:hAnsi="Arial" w:eastAsia="宋体" w:cs="Arial"/>
+          <w:color w:val="000000" w:themeColor="text1"/>
+          <w:sz w:val="22"/>
+          <w:szCs w:val="22"/>
+          <w:highlight w:val="none"/>
+          <w:lang w:val="en-US" w:eastAsia="zh-CN"/>
+          <w14:textFill>
+            <w14:solidFill>
+              <w14:schemeClr w14:val="tx1"/>
+            </w14:solidFill>
+          </w14:textFill>
+        </w:rPr>
+        <w:t>“toc”</w:t>
+      </w:r>
+      <w:r>
+        <w:rPr>
+          <w:rFonts w:hint="eastAsia" w:ascii="Arial" w:hAnsi="Arial" w:eastAsia="宋体" w:cs="Arial"/>
+          <w:color w:val="000000" w:themeColor="text1"/>
+          <w:sz w:val="22"/>
+          <w:szCs w:val="22"/>
+          <w:highlight w:val="none"/>
+          <w:lang w:val="en-US" w:eastAsia="zh-CN"/>
+          <w14:textFill>
+            <w14:solidFill>
+              <w14:schemeClr w14:val="tx1"/>
+            </w14:solidFill>
+          </w14:textFill>
+        </w:rPr>
+        <w:t xml:space="preserve"> </w:t>
+      </w:r>
+      <w:r>
+        <w:rPr>
+          <w:rFonts w:hint="default" w:ascii="Arial" w:hAnsi="Arial" w:eastAsia="宋体" w:cs="Arial"/>
+          <w:color w:val="000000" w:themeColor="text1"/>
+          <w:sz w:val="22"/>
+          <w:szCs w:val="22"/>
+          <w:highlight w:val="none"/>
+          <w:lang w:val="en-US" w:eastAsia="zh-CN"/>
+          <w14:textFill>
+            <w14:solidFill>
+              <w14:schemeClr w14:val="tx1"/>
+            </w14:solidFill>
+          </w14:textFill>
+        </w:rPr>
+        <w:t>hardware timer. This shift allowed for a true derivative calculation (</w:t>
+      </w:r>
+      <w:r>
+        <w:rPr>
+          <w:rFonts w:hint="eastAsia" w:ascii="Arial" w:hAnsi="Arial" w:eastAsia="宋体" w:cs="Arial"/>
+          <w:color w:val="000000" w:themeColor="text1"/>
+          <w:sz w:val="22"/>
+          <w:szCs w:val="22"/>
+          <w:highlight w:val="none"/>
+          <w:lang w:val="en-US" w:eastAsia="zh-CN"/>
+          <w14:textFill>
+            <w14:solidFill>
+              <w14:schemeClr w14:val="tx1"/>
+            </w14:solidFill>
+          </w14:textFill>
+        </w:rPr>
+        <w:t>dT/dt</w:t>
+      </w:r>
+      <w:r>
+        <w:rPr>
+          <w:rFonts w:hint="default" w:ascii="Arial" w:hAnsi="Arial" w:eastAsia="宋体" w:cs="Arial"/>
+          <w:color w:val="000000" w:themeColor="text1"/>
+          <w:sz w:val="22"/>
+          <w:szCs w:val="22"/>
+          <w:highlight w:val="none"/>
+          <w:lang w:val="en-US" w:eastAsia="zh-CN"/>
+          <w14:textFill>
+            <w14:solidFill>
+              <w14:schemeClr w14:val="tx1"/>
+            </w14:solidFill>
+          </w14:textFill>
+        </w:rPr>
+        <w:t>) in Task 3, making the temperature predictions significantly more robust against minor processing delays in MATLAB. Furthermore, the modular design of the functions ensures that the documentation is accessible via the doc command</w:t>
+      </w:r>
+      <w:r>
+        <w:rPr>
+          <w:rFonts w:hint="eastAsia" w:ascii="Arial" w:hAnsi="Arial" w:eastAsia="宋体" w:cs="Arial"/>
+          <w:color w:val="000000" w:themeColor="text1"/>
+          <w:sz w:val="22"/>
+          <w:szCs w:val="22"/>
+          <w:highlight w:val="none"/>
+          <w:lang w:val="en-US" w:eastAsia="zh-CN"/>
+          <w14:textFill>
+            <w14:solidFill>
+              <w14:schemeClr w14:val="tx1"/>
+            </w14:solidFill>
+          </w14:textFill>
+        </w:rPr>
+        <w:t>.</w:t>
+      </w:r>
+    </w:p>
+    <w:p>
+      <w:pPr>
+        <w:spacing w:line="259" w:lineRule="auto"/>
+        <w:jc w:val="both"/>
+        <w:rPr>
+          <w:rFonts w:hint="eastAsia" w:ascii="Arial" w:hAnsi="Arial" w:eastAsia="宋体" w:cs="Arial"/>
+          <w:color w:val="000000" w:themeColor="text1"/>
+          <w:sz w:val="22"/>
+          <w:szCs w:val="22"/>
+          <w:highlight w:val="none"/>
+          <w:lang w:val="en-US" w:eastAsia="zh-CN"/>
+          <w14:textFill>
+            <w14:solidFill>
+              <w14:schemeClr w14:val="tx1"/>
+            </w14:solidFill>
+          </w14:textFill>
+        </w:rPr>
+      </w:pPr>
+      <w:r>
+        <w:rPr>
+          <w:rFonts w:hint="default" w:ascii="Arial" w:hAnsi="Arial" w:eastAsia="宋体" w:cs="Arial"/>
+          <w:color w:val="000000" w:themeColor="text1"/>
+          <w:sz w:val="22"/>
+          <w:szCs w:val="22"/>
+          <w:highlight w:val="none"/>
+          <w:lang w:val="en-US" w:eastAsia="zh-CN"/>
+          <w14:textFill>
+            <w14:solidFill>
+              <w14:schemeClr w14:val="tx1"/>
+            </w14:solidFill>
+          </w14:textFill>
+        </w:rPr>
+        <w:t>Limitations</w:t>
+      </w:r>
+      <w:r>
+        <w:rPr>
+          <w:rFonts w:hint="eastAsia" w:ascii="Arial" w:hAnsi="Arial" w:eastAsia="宋体" w:cs="Arial"/>
+          <w:color w:val="000000" w:themeColor="text1"/>
+          <w:sz w:val="22"/>
+          <w:szCs w:val="22"/>
+          <w:highlight w:val="none"/>
+          <w:lang w:val="en-US" w:eastAsia="zh-CN"/>
+          <w14:textFill>
+            <w14:solidFill>
+              <w14:schemeClr w14:val="tx1"/>
+            </w14:solidFill>
+          </w14:textFill>
+        </w:rPr>
+        <w:t>:</w:t>
+      </w:r>
+    </w:p>
+    <w:p>
+      <w:pPr>
+        <w:spacing w:line="259" w:lineRule="auto"/>
+        <w:jc w:val="both"/>
+        <w:rPr>
+          <w:rFonts w:hint="default" w:ascii="Arial" w:hAnsi="Arial" w:eastAsia="宋体" w:cs="Arial"/>
+          <w:color w:val="000000" w:themeColor="text1"/>
+          <w:sz w:val="22"/>
+          <w:szCs w:val="22"/>
+          <w:highlight w:val="none"/>
+          <w:lang w:val="en-US" w:eastAsia="zh-CN"/>
+          <w14:textFill>
+            <w14:solidFill>
+              <w14:schemeClr w14:val="tx1"/>
+            </w14:solidFill>
+          </w14:textFill>
+        </w:rPr>
+      </w:pPr>
+      <w:r>
+        <w:rPr>
+          <w:rFonts w:hint="default" w:ascii="Arial" w:hAnsi="Arial" w:eastAsia="宋体" w:cs="Arial"/>
+          <w:color w:val="000000" w:themeColor="text1"/>
+          <w:sz w:val="22"/>
+          <w:szCs w:val="22"/>
+          <w:highlight w:val="none"/>
+          <w:lang w:val="en-US" w:eastAsia="zh-CN"/>
+          <w14:textFill>
+            <w14:solidFill>
+              <w14:schemeClr w14:val="tx1"/>
+            </w14:solidFill>
+          </w14:textFill>
+        </w:rPr>
+        <w:t>The current system relies on a simple linear prediction model (T_</w:t>
+      </w:r>
+      <w:r>
+        <w:rPr>
+          <w:rFonts w:hint="eastAsia" w:ascii="Arial" w:hAnsi="Arial" w:eastAsia="宋体" w:cs="Arial"/>
+          <w:color w:val="000000" w:themeColor="text1"/>
+          <w:sz w:val="22"/>
+          <w:szCs w:val="22"/>
+          <w:highlight w:val="none"/>
+          <w:lang w:val="en-US" w:eastAsia="zh-CN"/>
+          <w14:textFill>
+            <w14:solidFill>
+              <w14:schemeClr w14:val="tx1"/>
+            </w14:solidFill>
+          </w14:textFill>
+        </w:rPr>
+        <w:t>now</w:t>
+      </w:r>
+      <w:r>
+        <w:rPr>
+          <w:rFonts w:hint="default" w:ascii="Arial" w:hAnsi="Arial" w:eastAsia="宋体" w:cs="Arial"/>
+          <w:color w:val="000000" w:themeColor="text1"/>
+          <w:sz w:val="22"/>
+          <w:szCs w:val="22"/>
+          <w:highlight w:val="none"/>
+          <w:lang w:val="en-US" w:eastAsia="zh-CN"/>
+          <w14:textFill>
+            <w14:solidFill>
+              <w14:schemeClr w14:val="tx1"/>
+            </w14:solidFill>
+          </w14:textFill>
+        </w:rPr>
+        <w:t xml:space="preserve"> + Rate </w:t>
+      </w:r>
+      <w:r>
+        <w:rPr>
+          <w:rFonts w:hint="eastAsia" w:ascii="Arial" w:hAnsi="Arial" w:eastAsia="宋体" w:cs="Arial"/>
+          <w:color w:val="000000" w:themeColor="text1"/>
+          <w:sz w:val="22"/>
+          <w:szCs w:val="22"/>
+          <w:highlight w:val="none"/>
+          <w:lang w:val="en-US" w:eastAsia="zh-CN"/>
+          <w14:textFill>
+            <w14:solidFill>
+              <w14:schemeClr w14:val="tx1"/>
+            </w14:solidFill>
+          </w14:textFill>
+        </w:rPr>
+        <w:t>*Time</w:t>
+      </w:r>
+      <w:r>
+        <w:rPr>
+          <w:rFonts w:hint="default" w:ascii="Arial" w:hAnsi="Arial" w:eastAsia="宋体" w:cs="Arial"/>
+          <w:color w:val="000000" w:themeColor="text1"/>
+          <w:sz w:val="22"/>
+          <w:szCs w:val="22"/>
+          <w:highlight w:val="none"/>
+          <w:lang w:val="en-US" w:eastAsia="zh-CN"/>
+          <w14:textFill>
+            <w14:solidFill>
+              <w14:schemeClr w14:val="tx1"/>
+            </w14:solidFill>
+          </w14:textFill>
+        </w:rPr>
+        <w:t>). While effective for short-term monitoring, it assumes the rate of change remains constant, which may not accurately reflect real-world thermodynamic cooling or heating curves. Additionally, the system is sensitive to sensor noise; even small voltage fluctuations can cause the rate-of-change calculation to spike momentarily, triggering false alerts.</w:t>
+      </w:r>
+    </w:p>
+    <w:p>
+      <w:pPr>
+        <w:spacing w:line="259" w:lineRule="auto"/>
+        <w:jc w:val="both"/>
+        <w:rPr>
+          <w:rFonts w:hint="eastAsia" w:ascii="Arial" w:hAnsi="Arial" w:eastAsia="宋体" w:cs="Arial"/>
+          <w:color w:val="000000" w:themeColor="text1"/>
+          <w:sz w:val="22"/>
+          <w:szCs w:val="22"/>
+          <w:highlight w:val="none"/>
+          <w:lang w:val="en-US" w:eastAsia="zh-CN"/>
+          <w14:textFill>
+            <w14:solidFill>
+              <w14:schemeClr w14:val="tx1"/>
+            </w14:solidFill>
+          </w14:textFill>
+        </w:rPr>
+      </w:pPr>
+      <w:r>
+        <w:rPr>
+          <w:rFonts w:hint="default" w:ascii="Arial" w:hAnsi="Arial" w:eastAsia="宋体" w:cs="Arial"/>
+          <w:color w:val="000000" w:themeColor="text1"/>
+          <w:sz w:val="22"/>
+          <w:szCs w:val="22"/>
+          <w:highlight w:val="none"/>
+          <w:lang w:val="en-US" w:eastAsia="zh-CN"/>
+          <w14:textFill>
+            <w14:solidFill>
+              <w14:schemeClr w14:val="tx1"/>
+            </w14:solidFill>
+          </w14:textFill>
+        </w:rPr>
+        <w:t>Future Improvements</w:t>
+      </w:r>
+      <w:r>
+        <w:rPr>
+          <w:rFonts w:hint="eastAsia" w:ascii="Arial" w:hAnsi="Arial" w:eastAsia="宋体" w:cs="Arial"/>
+          <w:color w:val="000000" w:themeColor="text1"/>
+          <w:sz w:val="22"/>
+          <w:szCs w:val="22"/>
+          <w:highlight w:val="none"/>
+          <w:lang w:val="en-US" w:eastAsia="zh-CN"/>
+          <w14:textFill>
+            <w14:solidFill>
+              <w14:schemeClr w14:val="tx1"/>
+            </w14:solidFill>
+          </w14:textFill>
+        </w:rPr>
+        <w:t>:</w:t>
+      </w:r>
+    </w:p>
+    <w:p>
+      <w:pPr>
+        <w:numPr>
+          <w:ilvl w:val="0"/>
+          <w:numId w:val="2"/>
+        </w:numPr>
+        <w:spacing w:line="259" w:lineRule="auto"/>
+        <w:ind w:left="420" w:leftChars="0" w:hanging="420" w:firstLineChars="0"/>
+        <w:jc w:val="both"/>
+        <w:rPr>
+          <w:rFonts w:hint="eastAsia" w:ascii="Arial" w:hAnsi="Arial" w:eastAsia="宋体" w:cs="Arial"/>
+          <w:color w:val="000000" w:themeColor="text1"/>
+          <w:sz w:val="22"/>
+          <w:szCs w:val="22"/>
+          <w:highlight w:val="none"/>
+          <w:lang w:val="en-US" w:eastAsia="zh-CN"/>
+          <w14:textFill>
+            <w14:solidFill>
+              <w14:schemeClr w14:val="tx1"/>
+            </w14:solidFill>
+          </w14:textFill>
+        </w:rPr>
+      </w:pPr>
+      <w:r>
+        <w:rPr>
+          <w:rFonts w:hint="eastAsia" w:ascii="Arial" w:hAnsi="Arial" w:eastAsia="宋体" w:cs="Arial"/>
+          <w:color w:val="000000" w:themeColor="text1"/>
+          <w:sz w:val="22"/>
+          <w:szCs w:val="22"/>
+          <w:highlight w:val="none"/>
+          <w:lang w:val="en-US" w:eastAsia="zh-CN"/>
+          <w14:textFill>
+            <w14:solidFill>
+              <w14:schemeClr w14:val="tx1"/>
+            </w14:solidFill>
+          </w14:textFill>
+        </w:rPr>
+        <w:t>Data Smoothing: Add a digital filter to stop the LEDs from flickering due to small electronic "noise" in the sensor readings.</w:t>
+      </w:r>
+    </w:p>
+    <w:p>
+      <w:pPr>
+        <w:numPr>
+          <w:ilvl w:val="0"/>
+          <w:numId w:val="2"/>
+        </w:numPr>
+        <w:spacing w:line="259" w:lineRule="auto"/>
+        <w:ind w:left="420" w:leftChars="0" w:hanging="420" w:firstLineChars="0"/>
+        <w:jc w:val="both"/>
+        <w:rPr>
+          <w:rFonts w:hint="eastAsia" w:ascii="Arial" w:hAnsi="Arial" w:eastAsia="宋体" w:cs="Arial"/>
+          <w:color w:val="000000" w:themeColor="text1"/>
+          <w:sz w:val="22"/>
+          <w:szCs w:val="22"/>
+          <w:highlight w:val="none"/>
+          <w:lang w:val="en-US" w:eastAsia="zh-CN"/>
+          <w14:textFill>
+            <w14:solidFill>
+              <w14:schemeClr w14:val="tx1"/>
+            </w14:solidFill>
+          </w14:textFill>
+        </w:rPr>
+      </w:pPr>
+      <w:r>
+        <w:rPr>
+          <w:rFonts w:hint="eastAsia" w:ascii="Arial" w:hAnsi="Arial" w:eastAsia="宋体" w:cs="Arial"/>
+          <w:color w:val="000000" w:themeColor="text1"/>
+          <w:sz w:val="22"/>
+          <w:szCs w:val="22"/>
+          <w:highlight w:val="none"/>
+          <w:lang w:val="en-US" w:eastAsia="zh-CN"/>
+          <w14:textFill>
+            <w14:solidFill>
+              <w14:schemeClr w14:val="tx1"/>
+            </w14:solidFill>
+          </w14:textFill>
+        </w:rPr>
+        <w:t>Smarter Prediction: Use a curved line instead of a straight line to predict temperature, as real objects cool down or heat up more slowly over time.</w:t>
+      </w:r>
+    </w:p>
+    <w:p>
+      <w:pPr>
+        <w:spacing w:line="259" w:lineRule="auto"/>
+        <w:jc w:val="both"/>
+        <w:rPr>
+          <w:rFonts w:hint="default" w:ascii="Arial" w:hAnsi="Arial" w:eastAsia="宋体" w:cs="Arial"/>
+          <w:color w:val="000000" w:themeColor="text1"/>
+          <w:sz w:val="22"/>
+          <w:szCs w:val="22"/>
+          <w:highlight w:val="none"/>
+          <w:lang w:val="en-US" w:eastAsia="zh-CN"/>
+          <w14:textFill>
+            <w14:solidFill>
+              <w14:schemeClr w14:val="tx1"/>
+            </w14:solidFill>
+          </w14:textFill>
+        </w:rPr>
+      </w:pPr>
+    </w:p>
     <w:sectPr>
       <w:headerReference r:id="rId6" w:type="first"/>
       <w:footerReference r:id="rId8" w:type="first"/>
@@ -1206,7 +1925,7 @@
     <w:sdtPr>
       <w:id w:val="1214853255"/>
       <w:docPartObj>
-        <w:docPartGallery w:val="AutoText"/>
+        <w:docPartGallery w:val="autotext"/>
       </w:docPartObj>
     </w:sdtPr>
     <w:sdtContent>
@@ -1675,8 +2394,28 @@
       </w:pPr>
     </w:lvl>
   </w:abstractNum>
+  <w:abstractNum w:abstractNumId="1">
+    <w:nsid w:val="4D3D4C40"/>
+    <w:multiLevelType w:val="singleLevel"/>
+    <w:tmpl w:val="4D3D4C40"/>
+    <w:lvl w:ilvl="0" w:tentative="0">
+      <w:start w:val="1"/>
+      <w:numFmt w:val="bullet"/>
+      <w:lvlText w:val=""/>
+      <w:lvlJc w:val="left"/>
+      <w:pPr>
+        <w:ind w:left="420" w:hanging="420"/>
+      </w:pPr>
+      <w:rPr>
+        <w:rFonts w:hint="default" w:ascii="Wingdings" w:hAnsi="Wingdings"/>
+      </w:rPr>
+    </w:lvl>
+  </w:abstractNum>
   <w:num w:numId="1">
     <w:abstractNumId w:val="0"/>
+  </w:num>
+  <w:num w:numId="2">
+    <w:abstractNumId w:val="1"/>
   </w:num>
 </w:numbering>
 </file>
@@ -1686,7 +2425,7 @@
   <w:docDefaults>
     <w:rPrDefault>
       <w:rPr>
-        <w:rFonts w:asciiTheme="minorHAnsi" w:hAnsiTheme="minorHAnsi" w:eastAsiaTheme="minorHAnsi" w:cstheme="minorBidi"/>
+        <w:rFonts w:ascii="Times New Roman" w:hAnsi="Times New Roman" w:eastAsia="宋体" w:cs="Times New Roman"/>
       </w:rPr>
     </w:rPrDefault>
     <w:pPrDefault/>

</xml_diff>

<commit_message>
complated word doc with the screenshot of github implementation
</commit_message>
<xml_diff>
--- a/MATLAB Coursework 2  Word Template.docx
+++ b/MATLAB Coursework 2  Word Template.docx
@@ -335,8 +335,6 @@
           </w14:textFill>
         </w:rPr>
       </w:pPr>
-      <w:bookmarkStart w:id="0" w:name="_GoBack"/>
-      <w:bookmarkEnd w:id="0"/>
       <w:r>
         <w:rPr>
           <w:rFonts w:hint="eastAsia" w:eastAsia="宋体"/>
@@ -1862,6 +1860,242 @@
     </w:p>
     <w:p>
       <w:pPr>
+        <w:numPr>
+          <w:numId w:val="0"/>
+        </w:numPr>
+        <w:spacing w:after="160" w:line="259" w:lineRule="auto"/>
+        <w:jc w:val="both"/>
+        <w:rPr>
+          <w:rFonts w:hint="eastAsia" w:ascii="Arial" w:hAnsi="Arial" w:eastAsia="宋体" w:cs="Arial"/>
+          <w:color w:val="000000" w:themeColor="text1"/>
+          <w:sz w:val="22"/>
+          <w:szCs w:val="22"/>
+          <w:highlight w:val="none"/>
+          <w:lang w:val="en-US" w:eastAsia="zh-CN"/>
+          <w14:textFill>
+            <w14:solidFill>
+              <w14:schemeClr w14:val="tx1"/>
+            </w14:solidFill>
+          </w14:textFill>
+        </w:rPr>
+      </w:pPr>
+    </w:p>
+    <w:p>
+      <w:pPr>
+        <w:numPr>
+          <w:numId w:val="0"/>
+        </w:numPr>
+        <w:spacing w:after="160" w:line="259" w:lineRule="auto"/>
+        <w:jc w:val="both"/>
+        <w:rPr>
+          <w:rFonts w:hint="eastAsia" w:ascii="Arial" w:hAnsi="Arial" w:eastAsia="宋体" w:cs="Arial"/>
+          <w:color w:val="000000" w:themeColor="text1"/>
+          <w:sz w:val="22"/>
+          <w:szCs w:val="22"/>
+          <w:highlight w:val="none"/>
+          <w:lang w:val="en-US" w:eastAsia="zh-CN"/>
+          <w14:textFill>
+            <w14:solidFill>
+              <w14:schemeClr w14:val="tx1"/>
+            </w14:solidFill>
+          </w14:textFill>
+        </w:rPr>
+      </w:pPr>
+    </w:p>
+    <w:p>
+      <w:pPr>
+        <w:numPr>
+          <w:numId w:val="0"/>
+        </w:numPr>
+        <w:spacing w:after="160" w:line="259" w:lineRule="auto"/>
+        <w:jc w:val="both"/>
+        <w:rPr>
+          <w:rFonts w:hint="eastAsia" w:ascii="Arial" w:hAnsi="Arial" w:eastAsia="宋体" w:cs="Arial"/>
+          <w:color w:val="000000" w:themeColor="text1"/>
+          <w:sz w:val="22"/>
+          <w:szCs w:val="22"/>
+          <w:highlight w:val="none"/>
+          <w:lang w:val="en-US" w:eastAsia="zh-CN"/>
+          <w14:textFill>
+            <w14:solidFill>
+              <w14:schemeClr w14:val="tx1"/>
+            </w14:solidFill>
+          </w14:textFill>
+        </w:rPr>
+      </w:pPr>
+    </w:p>
+    <w:p>
+      <w:pPr>
+        <w:numPr>
+          <w:numId w:val="0"/>
+        </w:numPr>
+        <w:spacing w:after="160" w:line="259" w:lineRule="auto"/>
+        <w:jc w:val="both"/>
+        <w:rPr>
+          <w:rFonts w:hint="eastAsia" w:ascii="Arial" w:hAnsi="Arial" w:eastAsia="宋体" w:cs="Arial"/>
+          <w:color w:val="000000" w:themeColor="text1"/>
+          <w:sz w:val="22"/>
+          <w:szCs w:val="22"/>
+          <w:highlight w:val="none"/>
+          <w:lang w:val="en-US" w:eastAsia="zh-CN"/>
+          <w14:textFill>
+            <w14:solidFill>
+              <w14:schemeClr w14:val="tx1"/>
+            </w14:solidFill>
+          </w14:textFill>
+        </w:rPr>
+      </w:pPr>
+    </w:p>
+    <w:p>
+      <w:pPr>
+        <w:numPr>
+          <w:numId w:val="0"/>
+        </w:numPr>
+        <w:spacing w:after="160" w:line="259" w:lineRule="auto"/>
+        <w:jc w:val="both"/>
+        <w:rPr>
+          <w:rFonts w:hint="eastAsia" w:ascii="Arial" w:hAnsi="Arial" w:eastAsia="宋体" w:cs="Arial"/>
+          <w:color w:val="000000" w:themeColor="text1"/>
+          <w:sz w:val="22"/>
+          <w:szCs w:val="22"/>
+          <w:highlight w:val="none"/>
+          <w:lang w:val="en-US" w:eastAsia="zh-CN"/>
+          <w14:textFill>
+            <w14:solidFill>
+              <w14:schemeClr w14:val="tx1"/>
+            </w14:solidFill>
+          </w14:textFill>
+        </w:rPr>
+      </w:pPr>
+    </w:p>
+    <w:p>
+      <w:pPr>
+        <w:numPr>
+          <w:numId w:val="0"/>
+        </w:numPr>
+        <w:spacing w:after="160" w:line="259" w:lineRule="auto"/>
+        <w:jc w:val="both"/>
+        <w:rPr>
+          <w:rFonts w:hint="eastAsia" w:ascii="Arial" w:hAnsi="Arial" w:eastAsia="宋体" w:cs="Arial"/>
+          <w:color w:val="000000" w:themeColor="text1"/>
+          <w:sz w:val="22"/>
+          <w:szCs w:val="22"/>
+          <w:highlight w:val="none"/>
+          <w:lang w:val="en-US" w:eastAsia="zh-CN"/>
+          <w14:textFill>
+            <w14:solidFill>
+              <w14:schemeClr w14:val="tx1"/>
+            </w14:solidFill>
+          </w14:textFill>
+        </w:rPr>
+      </w:pPr>
+    </w:p>
+    <w:p>
+      <w:pPr>
+        <w:numPr>
+          <w:numId w:val="0"/>
+        </w:numPr>
+        <w:spacing w:after="160" w:line="259" w:lineRule="auto"/>
+        <w:jc w:val="both"/>
+        <w:rPr>
+          <w:rFonts w:hint="eastAsia" w:ascii="Arial" w:hAnsi="Arial" w:eastAsia="宋体" w:cs="Arial"/>
+          <w:color w:val="000000" w:themeColor="text1"/>
+          <w:sz w:val="22"/>
+          <w:szCs w:val="22"/>
+          <w:highlight w:val="none"/>
+          <w:lang w:val="en-US" w:eastAsia="zh-CN"/>
+          <w14:textFill>
+            <w14:solidFill>
+              <w14:schemeClr w14:val="tx1"/>
+            </w14:solidFill>
+          </w14:textFill>
+        </w:rPr>
+      </w:pPr>
+    </w:p>
+    <w:p>
+      <w:pPr>
+        <w:numPr>
+          <w:numId w:val="0"/>
+        </w:numPr>
+        <w:spacing w:after="160" w:line="259" w:lineRule="auto"/>
+        <w:jc w:val="both"/>
+        <w:rPr>
+          <w:rFonts w:hint="eastAsia" w:ascii="Arial" w:hAnsi="Arial" w:eastAsia="宋体" w:cs="Arial"/>
+          <w:color w:val="000000" w:themeColor="text1"/>
+          <w:sz w:val="22"/>
+          <w:szCs w:val="22"/>
+          <w:highlight w:val="none"/>
+          <w:lang w:val="en-US" w:eastAsia="zh-CN"/>
+          <w14:textFill>
+            <w14:solidFill>
+              <w14:schemeClr w14:val="tx1"/>
+            </w14:solidFill>
+          </w14:textFill>
+        </w:rPr>
+      </w:pPr>
+    </w:p>
+    <w:p>
+      <w:pPr>
+        <w:numPr>
+          <w:numId w:val="0"/>
+        </w:numPr>
+        <w:spacing w:after="160" w:line="259" w:lineRule="auto"/>
+        <w:jc w:val="both"/>
+        <w:rPr>
+          <w:rFonts w:hint="eastAsia" w:ascii="Arial" w:hAnsi="Arial" w:eastAsia="宋体" w:cs="Arial"/>
+          <w:color w:val="000000" w:themeColor="text1"/>
+          <w:sz w:val="22"/>
+          <w:szCs w:val="22"/>
+          <w:highlight w:val="none"/>
+          <w:lang w:val="en-US" w:eastAsia="zh-CN"/>
+          <w14:textFill>
+            <w14:solidFill>
+              <w14:schemeClr w14:val="tx1"/>
+            </w14:solidFill>
+          </w14:textFill>
+        </w:rPr>
+      </w:pPr>
+    </w:p>
+    <w:p>
+      <w:pPr>
+        <w:numPr>
+          <w:numId w:val="0"/>
+        </w:numPr>
+        <w:spacing w:after="160" w:line="259" w:lineRule="auto"/>
+        <w:jc w:val="both"/>
+        <w:rPr>
+          <w:rFonts w:hint="eastAsia" w:ascii="Arial" w:hAnsi="Arial" w:eastAsia="宋体" w:cs="Arial"/>
+          <w:color w:val="000000" w:themeColor="text1"/>
+          <w:sz w:val="22"/>
+          <w:szCs w:val="22"/>
+          <w:highlight w:val="none"/>
+          <w:lang w:val="en-US" w:eastAsia="zh-CN"/>
+          <w14:textFill>
+            <w14:solidFill>
+              <w14:schemeClr w14:val="tx1"/>
+            </w14:solidFill>
+          </w14:textFill>
+        </w:rPr>
+      </w:pPr>
+      <w:r>
+        <w:rPr>
+          <w:rFonts w:hint="eastAsia" w:ascii="Arial" w:hAnsi="Arial" w:eastAsia="宋体" w:cs="Arial"/>
+          <w:color w:val="000000" w:themeColor="text1"/>
+          <w:sz w:val="22"/>
+          <w:szCs w:val="22"/>
+          <w:highlight w:val="none"/>
+          <w:lang w:val="en-US" w:eastAsia="zh-CN"/>
+          <w14:textFill>
+            <w14:solidFill>
+              <w14:schemeClr w14:val="tx1"/>
+            </w14:solidFill>
+          </w14:textFill>
+        </w:rPr>
+        <w:t>Task5-Implemtation of Github</w:t>
+      </w:r>
+    </w:p>
+    <w:p>
+      <w:pPr>
         <w:spacing w:line="259" w:lineRule="auto"/>
         <w:jc w:val="both"/>
         <w:rPr>
@@ -1878,6 +2112,51 @@
           </w14:textFill>
         </w:rPr>
       </w:pPr>
+      <w:r>
+        <w:drawing>
+          <wp:inline distT="0" distB="0" distL="114300" distR="114300">
+            <wp:extent cx="5730240" cy="3909695"/>
+            <wp:effectExtent l="0" t="0" r="3810" b="5080"/>
+            <wp:docPr id="10" name="图片 1"/>
+            <wp:cNvGraphicFramePr>
+              <a:graphicFrameLocks xmlns:a="http://schemas.openxmlformats.org/drawingml/2006/main" noChangeAspect="1"/>
+            </wp:cNvGraphicFramePr>
+            <a:graphic xmlns:a="http://schemas.openxmlformats.org/drawingml/2006/main">
+              <a:graphicData uri="http://schemas.openxmlformats.org/drawingml/2006/picture">
+                <pic:pic xmlns:pic="http://schemas.openxmlformats.org/drawingml/2006/picture">
+                  <pic:nvPicPr>
+                    <pic:cNvPr id="10" name="图片 1"/>
+                    <pic:cNvPicPr>
+                      <a:picLocks noChangeAspect="1"/>
+                    </pic:cNvPicPr>
+                  </pic:nvPicPr>
+                  <pic:blipFill>
+                    <a:blip r:embed="rId17"/>
+                    <a:stretch>
+                      <a:fillRect/>
+                    </a:stretch>
+                  </pic:blipFill>
+                  <pic:spPr>
+                    <a:xfrm>
+                      <a:off x="0" y="0"/>
+                      <a:ext cx="5730240" cy="3909695"/>
+                    </a:xfrm>
+                    <a:prstGeom prst="rect">
+                      <a:avLst/>
+                    </a:prstGeom>
+                    <a:noFill/>
+                    <a:ln>
+                      <a:noFill/>
+                    </a:ln>
+                  </pic:spPr>
+                </pic:pic>
+              </a:graphicData>
+            </a:graphic>
+          </wp:inline>
+        </w:drawing>
+      </w:r>
+      <w:bookmarkStart w:id="0" w:name="_GoBack"/>
+      <w:bookmarkEnd w:id="0"/>
     </w:p>
     <w:sectPr>
       <w:headerReference r:id="rId6" w:type="first"/>

</xml_diff>